<commit_message>
Pagination: keep headings with content, no split table rows, short tables kept whole, no forced breaks after the cover
Co-Authored-By: Claude Opus 5.5 <noreply@anthropic.com>
Claude-Session: https://claude.ai/code/session_01ChEN58PbdXFZmwUoBZYBRb
</commit_message>
<xml_diff>
--- a/deliverables/Egypt/Egypt_Profile_DRAFT.docx
+++ b/deliverables/Egypt/Egypt_Profile_DRAFT.docx
@@ -3,6 +3,9 @@
 <w:document xmlns:wpc="http://schemas.microsoft.com/office/word/2010/wordprocessingCanvas" xmlns:mo="http://schemas.microsoft.com/office/mac/office/2008/main" xmlns:mc="http://schemas.openxmlformats.org/markup-compatibility/2006" xmlns:mv="urn:schemas-microsoft-com:mac:vml" xmlns:o="urn:schemas-microsoft-com:office:office" xmlns:r="http://schemas.openxmlformats.org/officeDocument/2006/relationships" xmlns:m="http://schemas.openxmlformats.org/officeDocument/2006/math" xmlns:v="urn:schemas-microsoft-com:vml" xmlns:wp14="http://schemas.microsoft.com/office/word/2010/wordprocessingDrawing" xmlns:wp="http://schemas.openxmlformats.org/drawingml/2006/wordprocessingDrawing" xmlns:w10="urn:schemas-microsoft-com:office:word" xmlns:w="http://schemas.openxmlformats.org/wordprocessingml/2006/main" xmlns:w14="http://schemas.microsoft.com/office/word/2010/wordml" xmlns:wpg="http://schemas.microsoft.com/office/word/2010/wordprocessingGroup" xmlns:wpi="http://schemas.microsoft.com/office/word/2010/wordprocessingInk" xmlns:wne="http://schemas.microsoft.com/office/word/2006/wordml" xmlns:wps="http://schemas.microsoft.com/office/word/2010/wordprocessingShape" mc:Ignorable="w14 wp14">
   <w:body>
     <w:p>
+      <w:pPr>
+        <w:widowControl/>
+      </w:pPr>
       <w:r>
         <w:rPr>
           <w:b/>
@@ -21,6 +24,10 @@
       </w:r>
     </w:p>
     <w:p>
+      <w:pPr>
+        <w:keepNext/>
+        <w:widowControl/>
+      </w:pPr>
       <w:r>
         <w:drawing>
           <wp:inline xmlns:a="http://schemas.openxmlformats.org/drawingml/2006/main" xmlns:pic="http://schemas.openxmlformats.org/drawingml/2006/picture">
@@ -58,6 +65,7 @@
     </w:p>
     <w:p>
       <w:pPr>
+        <w:widowControl/>
         <w:spacing w:after="80"/>
         <w:jc w:val="right"/>
       </w:pPr>
@@ -71,6 +79,7 @@
     </w:p>
     <w:p>
       <w:pPr>
+        <w:widowControl/>
         <w:spacing w:before="240" w:after="280"/>
       </w:pPr>
       <w:r>
@@ -83,6 +92,7 @@
     </w:p>
     <w:p>
       <w:pPr>
+        <w:widowControl/>
         <w:tabs>
           <w:tab w:pos="9746" w:val="right" w:leader="dot"/>
         </w:tabs>
@@ -118,6 +128,7 @@
     </w:p>
     <w:p>
       <w:pPr>
+        <w:widowControl/>
         <w:tabs>
           <w:tab w:pos="9746" w:val="right" w:leader="dot"/>
         </w:tabs>
@@ -153,6 +164,7 @@
     </w:p>
     <w:p>
       <w:pPr>
+        <w:widowControl/>
         <w:tabs>
           <w:tab w:pos="9746" w:val="right" w:leader="dot"/>
         </w:tabs>
@@ -188,6 +200,7 @@
     </w:p>
     <w:p>
       <w:pPr>
+        <w:widowControl/>
         <w:tabs>
           <w:tab w:pos="9746" w:val="right" w:leader="dot"/>
         </w:tabs>
@@ -223,6 +236,7 @@
     </w:p>
     <w:p>
       <w:pPr>
+        <w:widowControl/>
         <w:tabs>
           <w:tab w:pos="9746" w:val="right" w:leader="dot"/>
         </w:tabs>
@@ -258,6 +272,7 @@
     </w:p>
     <w:p>
       <w:pPr>
+        <w:widowControl/>
         <w:tabs>
           <w:tab w:pos="9746" w:val="right" w:leader="dot"/>
         </w:tabs>
@@ -293,6 +308,7 @@
     </w:p>
     <w:p>
       <w:pPr>
+        <w:widowControl/>
         <w:tabs>
           <w:tab w:pos="9746" w:val="right" w:leader="dot"/>
         </w:tabs>
@@ -328,6 +344,7 @@
     </w:p>
     <w:p>
       <w:pPr>
+        <w:widowControl/>
         <w:tabs>
           <w:tab w:pos="9746" w:val="right" w:leader="dot"/>
         </w:tabs>
@@ -363,6 +380,7 @@
     </w:p>
     <w:p>
       <w:pPr>
+        <w:widowControl/>
         <w:tabs>
           <w:tab w:pos="9746" w:val="right" w:leader="dot"/>
         </w:tabs>
@@ -398,6 +416,7 @@
     </w:p>
     <w:p>
       <w:pPr>
+        <w:widowControl/>
         <w:tabs>
           <w:tab w:pos="9746" w:val="right" w:leader="dot"/>
         </w:tabs>
@@ -433,6 +452,7 @@
     </w:p>
     <w:p>
       <w:pPr>
+        <w:widowControl/>
         <w:tabs>
           <w:tab w:pos="9746" w:val="right" w:leader="dot"/>
         </w:tabs>
@@ -468,6 +488,7 @@
     </w:p>
     <w:p>
       <w:pPr>
+        <w:widowControl/>
         <w:tabs>
           <w:tab w:pos="9746" w:val="right" w:leader="dot"/>
         </w:tabs>
@@ -503,6 +524,7 @@
     </w:p>
     <w:p>
       <w:pPr>
+        <w:widowControl/>
         <w:tabs>
           <w:tab w:pos="9746" w:val="right" w:leader="dot"/>
         </w:tabs>
@@ -538,6 +560,7 @@
     </w:p>
     <w:p>
       <w:pPr>
+        <w:widowControl/>
         <w:tabs>
           <w:tab w:pos="9746" w:val="right" w:leader="dot"/>
         </w:tabs>
@@ -573,6 +596,7 @@
     </w:p>
     <w:p>
       <w:pPr>
+        <w:widowControl/>
         <w:tabs>
           <w:tab w:pos="9746" w:val="right" w:leader="dot"/>
         </w:tabs>
@@ -607,6 +631,9 @@
       </w:r>
     </w:p>
     <w:p>
+      <w:pPr>
+        <w:widowControl/>
+      </w:pPr>
       <w:r>
         <w:br w:type="page"/>
       </w:r>
@@ -614,6 +641,8 @@
     <w:p>
       <w:pPr>
         <w:pStyle w:val="Heading1"/>
+        <w:keepNext/>
+        <w:widowControl/>
       </w:pPr>
       <w:bookmarkStart w:id="1" w:name="_sec1"/>
       <w:r>
@@ -624,6 +653,8 @@
     <w:p>
       <w:pPr>
         <w:spacing w:before="0" w:after="80"/>
+        <w:keepNext/>
+        <w:widowControl/>
         <w:pBdr>
           <w:bottom w:val="single" w:sz="12" w:space="1" w:color="D91F2C"/>
         </w:pBdr>
@@ -632,6 +663,8 @@
     <w:p>
       <w:pPr>
         <w:pStyle w:val="Heading2"/>
+        <w:keepNext/>
+        <w:widowControl/>
       </w:pPr>
       <w:bookmarkStart w:id="2" w:name="_sec2"/>
       <w:r>
@@ -653,12 +686,16 @@
         <w:gridCol w:w="2436"/>
       </w:tblGrid>
       <w:tr>
+        <w:trPr>
+          <w:cantSplit/>
+        </w:trPr>
         <w:tc>
           <w:tcPr>
             <w:tcW w:type="dxa" w:w="2436"/>
           </w:tcPr>
           <w:p>
             <w:pPr>
+              <w:keepNext/>
               <w:spacing w:after="60"/>
             </w:pPr>
             <w:r>
@@ -677,6 +714,7 @@
           </w:tcPr>
           <w:p>
             <w:pPr>
+              <w:keepNext/>
               <w:spacing w:after="60"/>
             </w:pPr>
             <w:r>
@@ -702,6 +740,7 @@
           </w:tcPr>
           <w:p>
             <w:pPr>
+              <w:keepNext/>
               <w:spacing w:after="60"/>
             </w:pPr>
             <w:r>
@@ -720,6 +759,7 @@
           </w:tcPr>
           <w:p>
             <w:pPr>
+              <w:keepNext/>
               <w:spacing w:after="60"/>
             </w:pPr>
             <w:r>
@@ -741,12 +781,16 @@
         </w:tc>
       </w:tr>
       <w:tr>
+        <w:trPr>
+          <w:cantSplit/>
+        </w:trPr>
         <w:tc>
           <w:tcPr>
             <w:tcW w:type="dxa" w:w="2436"/>
           </w:tcPr>
           <w:p>
             <w:pPr>
+              <w:keepNext/>
               <w:spacing w:after="60"/>
             </w:pPr>
             <w:r>
@@ -765,6 +809,7 @@
           </w:tcPr>
           <w:p>
             <w:pPr>
+              <w:keepNext/>
               <w:spacing w:after="60"/>
             </w:pPr>
             <w:r>
@@ -790,6 +835,7 @@
           </w:tcPr>
           <w:p>
             <w:pPr>
+              <w:keepNext/>
               <w:spacing w:after="60"/>
             </w:pPr>
             <w:r>
@@ -808,6 +854,7 @@
           </w:tcPr>
           <w:p>
             <w:pPr>
+              <w:keepNext/>
               <w:spacing w:after="60"/>
             </w:pPr>
             <w:r>
@@ -829,12 +876,16 @@
         </w:tc>
       </w:tr>
       <w:tr>
+        <w:trPr>
+          <w:cantSplit/>
+        </w:trPr>
         <w:tc>
           <w:tcPr>
             <w:tcW w:type="dxa" w:w="2436"/>
           </w:tcPr>
           <w:p>
             <w:pPr>
+              <w:keepNext/>
               <w:spacing w:after="60"/>
             </w:pPr>
             <w:r>
@@ -853,6 +904,7 @@
           </w:tcPr>
           <w:p>
             <w:pPr>
+              <w:keepNext/>
               <w:spacing w:after="60"/>
             </w:pPr>
             <w:r>
@@ -878,6 +930,7 @@
           </w:tcPr>
           <w:p>
             <w:pPr>
+              <w:keepNext/>
               <w:spacing w:after="60"/>
             </w:pPr>
             <w:r>
@@ -896,6 +949,7 @@
           </w:tcPr>
           <w:p>
             <w:pPr>
+              <w:keepNext/>
               <w:spacing w:after="60"/>
             </w:pPr>
             <w:r>
@@ -917,12 +971,16 @@
         </w:tc>
       </w:tr>
       <w:tr>
+        <w:trPr>
+          <w:cantSplit/>
+        </w:trPr>
         <w:tc>
           <w:tcPr>
             <w:tcW w:type="dxa" w:w="2436"/>
           </w:tcPr>
           <w:p>
             <w:pPr>
+              <w:keepNext/>
               <w:spacing w:after="60"/>
             </w:pPr>
             <w:r>
@@ -941,6 +999,7 @@
           </w:tcPr>
           <w:p>
             <w:pPr>
+              <w:keepNext/>
               <w:spacing w:after="60"/>
             </w:pPr>
             <w:r>
@@ -966,6 +1025,7 @@
           </w:tcPr>
           <w:p>
             <w:pPr>
+              <w:keepNext/>
               <w:spacing w:after="60"/>
             </w:pPr>
             <w:r>
@@ -984,6 +1044,7 @@
           </w:tcPr>
           <w:p>
             <w:pPr>
+              <w:keepNext/>
               <w:spacing w:after="60"/>
             </w:pPr>
             <w:r>
@@ -1005,12 +1066,16 @@
         </w:tc>
       </w:tr>
       <w:tr>
+        <w:trPr>
+          <w:cantSplit/>
+        </w:trPr>
         <w:tc>
           <w:tcPr>
             <w:tcW w:type="dxa" w:w="2436"/>
           </w:tcPr>
           <w:p>
             <w:pPr>
+              <w:keepNext/>
               <w:spacing w:after="60"/>
             </w:pPr>
             <w:r>
@@ -1029,6 +1094,7 @@
           </w:tcPr>
           <w:p>
             <w:pPr>
+              <w:keepNext/>
               <w:spacing w:after="60"/>
             </w:pPr>
             <w:r>
@@ -1054,6 +1120,7 @@
           </w:tcPr>
           <w:p>
             <w:pPr>
+              <w:keepNext/>
               <w:spacing w:after="60"/>
             </w:pPr>
             <w:r>
@@ -1072,6 +1139,7 @@
           </w:tcPr>
           <w:p>
             <w:pPr>
+              <w:keepNext/>
               <w:spacing w:after="60"/>
             </w:pPr>
             <w:r>
@@ -1093,12 +1161,16 @@
         </w:tc>
       </w:tr>
       <w:tr>
+        <w:trPr>
+          <w:cantSplit/>
+        </w:trPr>
         <w:tc>
           <w:tcPr>
             <w:tcW w:type="dxa" w:w="2436"/>
           </w:tcPr>
           <w:p>
             <w:pPr>
+              <w:keepNext/>
               <w:spacing w:after="60"/>
             </w:pPr>
             <w:r>
@@ -1117,6 +1189,7 @@
           </w:tcPr>
           <w:p>
             <w:pPr>
+              <w:keepNext/>
               <w:spacing w:after="60"/>
             </w:pPr>
             <w:r>
@@ -1142,6 +1215,7 @@
           </w:tcPr>
           <w:p>
             <w:pPr>
+              <w:keepNext/>
               <w:spacing w:after="60"/>
             </w:pPr>
             <w:r>
@@ -1160,6 +1234,7 @@
           </w:tcPr>
           <w:p>
             <w:pPr>
+              <w:keepNext/>
               <w:spacing w:after="60"/>
             </w:pPr>
             <w:r>
@@ -1181,6 +1256,9 @@
         </w:tc>
       </w:tr>
       <w:tr>
+        <w:trPr>
+          <w:cantSplit/>
+        </w:trPr>
         <w:tc>
           <w:tcPr>
             <w:tcW w:type="dxa" w:w="2436"/>
@@ -1240,10 +1318,14 @@
     </w:tbl>
     <w:p>
       <w:pPr>
+        <w:widowControl/>
         <w:spacing w:after="40"/>
       </w:pPr>
     </w:p>
     <w:p>
+      <w:pPr>
+        <w:widowControl/>
+      </w:pPr>
       <w:r>
         <w:t>Egypt is the most populous Arab country. Its national count reached about 108.6 million at the start of 2026, up from 94.8 million in 2017, and CAPMAS projects it will become the world's 11th most populous country by 2050.</w:t>
       </w:r>
@@ -1303,6 +1385,9 @@
       </w:hyperlink>
     </w:p>
     <w:p>
+      <w:pPr>
+        <w:widowControl/>
+      </w:pPr>
       <w:r>
         <w:t>For a foreign academic medical center, the demographic picture points to a very large domestic patient base that is still young but beginning to age, with growing demand for chronic disease care, cardiology, oncology and maternal and child services. The public Healthcare Authority's medical tourism program is still small, earning about $8 million in 2025, so the larger opportunity lies in training, quality systems and specialty programs for a population of this size.</w:t>
       </w:r>
@@ -1319,6 +1404,8 @@
     <w:p>
       <w:pPr>
         <w:pStyle w:val="Heading2"/>
+        <w:keepNext/>
+        <w:widowControl/>
       </w:pPr>
       <w:bookmarkStart w:id="3" w:name="_sec3"/>
       <w:r>
@@ -1327,6 +1414,9 @@
       <w:bookmarkEnd w:id="3"/>
     </w:p>
     <w:p>
+      <w:pPr>
+        <w:widowControl/>
+      </w:pPr>
       <w:r>
         <w:t>Egypt is a republic with a strong, directly elected presidency under the 2014 Constitution, as amended in 2019. The amendments lengthened presidential terms from four to six years and added an upper chamber, the Senate, alongside the House of Representatives.</w:t>
       </w:r>
@@ -1400,6 +1490,8 @@
     <w:p>
       <w:pPr>
         <w:pStyle w:val="Heading2"/>
+        <w:keepNext/>
+        <w:widowControl/>
       </w:pPr>
       <w:bookmarkStart w:id="4" w:name="_sec4"/>
       <w:r>
@@ -1408,6 +1500,9 @@
       <w:bookmarkEnd w:id="4"/>
     </w:p>
     <w:p>
+      <w:pPr>
+        <w:widowControl/>
+      </w:pPr>
       <w:r>
         <w:t>Egypt is one of the largest Arab economies, with GDP of about $2.39 trillion on a purchasing power parity basis in 2025.</w:t>
       </w:r>
@@ -1502,6 +1597,8 @@
     <w:p>
       <w:pPr>
         <w:pStyle w:val="Heading2"/>
+        <w:keepNext/>
+        <w:widowControl/>
       </w:pPr>
       <w:bookmarkStart w:id="5" w:name="_sec5"/>
       <w:r>
@@ -1523,12 +1620,16 @@
         <w:gridCol w:w="2436"/>
       </w:tblGrid>
       <w:tr>
+        <w:trPr>
+          <w:cantSplit/>
+        </w:trPr>
         <w:tc>
           <w:tcPr>
             <w:tcW w:type="dxa" w:w="2436"/>
           </w:tcPr>
           <w:p>
             <w:pPr>
+              <w:keepNext/>
               <w:spacing w:after="60"/>
             </w:pPr>
             <w:r>
@@ -1547,6 +1648,7 @@
           </w:tcPr>
           <w:p>
             <w:pPr>
+              <w:keepNext/>
               <w:spacing w:after="60"/>
             </w:pPr>
             <w:r>
@@ -1572,6 +1674,7 @@
           </w:tcPr>
           <w:p>
             <w:pPr>
+              <w:keepNext/>
               <w:spacing w:after="60"/>
             </w:pPr>
             <w:r>
@@ -1590,6 +1693,7 @@
           </w:tcPr>
           <w:p>
             <w:pPr>
+              <w:keepNext/>
               <w:spacing w:after="60"/>
             </w:pPr>
             <w:r>
@@ -1611,6 +1715,9 @@
         </w:tc>
       </w:tr>
       <w:tr>
+        <w:trPr>
+          <w:cantSplit/>
+        </w:trPr>
         <w:tc>
           <w:tcPr>
             <w:tcW w:type="dxa" w:w="2436"/>
@@ -1670,10 +1777,14 @@
     </w:tbl>
     <w:p>
       <w:pPr>
+        <w:widowControl/>
         <w:spacing w:after="40"/>
       </w:pPr>
     </w:p>
     <w:p>
+      <w:pPr>
+        <w:widowControl/>
+      </w:pPr>
       <w:r>
         <w:t>Noncommunicable diseases now dominate Egypt's disease burden. In September 2025 Deputy Health Minister Amr Kandil said they account for about 80 percent of deaths, with cardiovascular disease alone responsible for 44 percent.</w:t>
       </w:r>
@@ -1738,6 +1849,8 @@
     <w:p>
       <w:pPr>
         <w:pStyle w:val="Heading1"/>
+        <w:keepNext/>
+        <w:widowControl/>
       </w:pPr>
       <w:bookmarkStart w:id="6" w:name="_sec6"/>
       <w:r>
@@ -1748,6 +1861,8 @@
     <w:p>
       <w:pPr>
         <w:spacing w:before="0" w:after="80"/>
+        <w:keepNext/>
+        <w:widowControl/>
         <w:pBdr>
           <w:bottom w:val="single" w:sz="12" w:space="1" w:color="D91F2C"/>
         </w:pBdr>
@@ -1756,6 +1871,8 @@
     <w:p>
       <w:pPr>
         <w:pStyle w:val="Heading2"/>
+        <w:keepNext/>
+        <w:widowControl/>
       </w:pPr>
       <w:bookmarkStart w:id="7" w:name="_sec7"/>
       <w:r>
@@ -1764,6 +1881,9 @@
       <w:bookmarkEnd w:id="7"/>
     </w:p>
     <w:p>
+      <w:pPr>
+        <w:widowControl/>
+      </w:pPr>
       <w:r>
         <w:t>Egypt's public health system is run by several bodies. The Ministry of Health and Population oversees primary care and general hospitals, university hospitals sit under the higher education ministry, and the General Authority for Healthcare operates facilities in governorates that have moved to the new insurance model.</w:t>
       </w:r>
@@ -1799,6 +1919,9 @@
       </w:hyperlink>
     </w:p>
     <w:p>
+      <w:pPr>
+        <w:widowControl/>
+      </w:pPr>
       <w:r>
         <w:t>The flagship reform is Universal Health Insurance, which separates the purchaser (the Universal Health Insurance Authority) from the providers and contracts with both public and private facilities. Phase one has been completed in six governorates: Port Said, Ismailia, Suez, South Sinai, Luxor and Aswan.</w:t>
       </w:r>
@@ -1860,6 +1983,8 @@
     <w:p>
       <w:pPr>
         <w:pStyle w:val="Heading2"/>
+        <w:keepNext/>
+        <w:widowControl/>
       </w:pPr>
       <w:bookmarkStart w:id="8" w:name="_sec8"/>
       <w:r>
@@ -1868,6 +1993,9 @@
       <w:bookmarkEnd w:id="8"/>
     </w:p>
     <w:p>
+      <w:pPr>
+        <w:widowControl/>
+      </w:pPr>
       <w:r>
         <w:t>Egypt's private sector is large, fragmented and still concentrated in Greater Cairo and Alexandria. Out-of-pocket payments covered 57 percent of current health spending in 2023, which sustains demand for private clinics and hospitals among those who can pay.</w:t>
       </w:r>
@@ -1974,6 +2102,8 @@
     <w:p>
       <w:pPr>
         <w:pStyle w:val="Heading2"/>
+        <w:keepNext/>
+        <w:widowControl/>
       </w:pPr>
       <w:bookmarkStart w:id="9" w:name="_sec9"/>
       <w:r>
@@ -1995,12 +2125,16 @@
         <w:gridCol w:w="2436"/>
       </w:tblGrid>
       <w:tr>
+        <w:trPr>
+          <w:cantSplit/>
+        </w:trPr>
         <w:tc>
           <w:tcPr>
             <w:tcW w:type="dxa" w:w="2436"/>
           </w:tcPr>
           <w:p>
             <w:pPr>
+              <w:keepNext/>
               <w:spacing w:after="60"/>
             </w:pPr>
             <w:r>
@@ -2019,6 +2153,7 @@
           </w:tcPr>
           <w:p>
             <w:pPr>
+              <w:keepNext/>
               <w:spacing w:after="60"/>
             </w:pPr>
             <w:r>
@@ -2044,6 +2179,7 @@
           </w:tcPr>
           <w:p>
             <w:pPr>
+              <w:keepNext/>
               <w:spacing w:after="60"/>
             </w:pPr>
             <w:r>
@@ -2062,6 +2198,7 @@
           </w:tcPr>
           <w:p>
             <w:pPr>
+              <w:keepNext/>
               <w:spacing w:after="60"/>
             </w:pPr>
             <w:r>
@@ -2083,6 +2220,9 @@
         </w:tc>
       </w:tr>
       <w:tr>
+        <w:trPr>
+          <w:cantSplit/>
+        </w:trPr>
         <w:tc>
           <w:tcPr>
             <w:tcW w:type="dxa" w:w="2436"/>
@@ -2173,10 +2313,14 @@
     </w:tbl>
     <w:p>
       <w:pPr>
+        <w:widowControl/>
         <w:spacing w:after="40"/>
       </w:pPr>
     </w:p>
     <w:p>
+      <w:pPr>
+        <w:widowControl/>
+      </w:pPr>
       <w:r>
         <w:t>Egypt spent about 4.9 percent of GDP on health in 2023, or roughly $141 per person, and the figure has stayed between about 4.2 and 5.4 percent since 2010.</w:t>
       </w:r>
@@ -2268,6 +2412,8 @@
     <w:p>
       <w:pPr>
         <w:pStyle w:val="Heading2"/>
+        <w:keepNext/>
+        <w:widowControl/>
       </w:pPr>
       <w:bookmarkStart w:id="10" w:name="_sec10"/>
       <w:r>
@@ -2289,12 +2435,16 @@
         <w:gridCol w:w="2436"/>
       </w:tblGrid>
       <w:tr>
+        <w:trPr>
+          <w:cantSplit/>
+        </w:trPr>
         <w:tc>
           <w:tcPr>
             <w:tcW w:type="dxa" w:w="2436"/>
           </w:tcPr>
           <w:p>
             <w:pPr>
+              <w:keepNext/>
               <w:spacing w:after="60"/>
             </w:pPr>
             <w:r>
@@ -2313,6 +2463,7 @@
           </w:tcPr>
           <w:p>
             <w:pPr>
+              <w:keepNext/>
               <w:spacing w:after="60"/>
             </w:pPr>
             <w:r>
@@ -2338,6 +2489,7 @@
           </w:tcPr>
           <w:p>
             <w:pPr>
+              <w:keepNext/>
               <w:spacing w:after="60"/>
             </w:pPr>
             <w:r>
@@ -2356,6 +2508,7 @@
           </w:tcPr>
           <w:p>
             <w:pPr>
+              <w:keepNext/>
               <w:spacing w:after="60"/>
             </w:pPr>
             <w:r>
@@ -2377,6 +2530,9 @@
         </w:tc>
       </w:tr>
       <w:tr>
+        <w:trPr>
+          <w:cantSplit/>
+        </w:trPr>
         <w:tc>
           <w:tcPr>
             <w:tcW w:type="dxa" w:w="2436"/>
@@ -2467,10 +2623,14 @@
     </w:tbl>
     <w:p>
       <w:pPr>
+        <w:widowControl/>
         <w:spacing w:after="40"/>
       </w:pPr>
     </w:p>
     <w:p>
+      <w:pPr>
+        <w:widowControl/>
+      </w:pPr>
       <w:r>
         <w:t>Egypt has about 0.67 physicians and 1.79 nurses and midwives per 1,000 people, and 1.06 hospital beds per 1,000.</w:t>
       </w:r>
@@ -2562,6 +2722,8 @@
     <w:p>
       <w:pPr>
         <w:pStyle w:val="Heading2"/>
+        <w:keepNext/>
+        <w:widowControl/>
       </w:pPr>
       <w:bookmarkStart w:id="11" w:name="_sec11"/>
       <w:r>
@@ -2570,6 +2732,9 @@
       <w:bookmarkEnd w:id="11"/>
     </w:p>
     <w:p>
+      <w:pPr>
+        <w:widowControl/>
+      </w:pPr>
       <w:r>
         <w:t>Under a reform approved in 2017, medical education in Egypt is a five-year undergraduate program after secondary school, entered through a competitive score cutoff, followed by a two-year internship, replacing the older system of six years of study and one internship year; postgraduate training follows.</w:t>
       </w:r>
@@ -2646,6 +2811,8 @@
     <w:p>
       <w:pPr>
         <w:pStyle w:val="Heading2"/>
+        <w:keepNext/>
+        <w:widowControl/>
       </w:pPr>
       <w:bookmarkStart w:id="12" w:name="_sec12"/>
       <w:r>
@@ -2654,6 +2821,9 @@
       <w:bookmarkEnd w:id="12"/>
     </w:p>
     <w:p>
+      <w:pPr>
+        <w:widowControl/>
+      </w:pPr>
       <w:r>
         <w:t>Egypt's health policy is organized around Universal Health Insurance, which the government plans to extend to about 13 million people in the second phase, with investment of more than EGP 115 billion.</w:t>
       </w:r>
@@ -2730,6 +2900,8 @@
     <w:p>
       <w:pPr>
         <w:pStyle w:val="Heading2"/>
+        <w:keepNext/>
+        <w:widowControl/>
       </w:pPr>
       <w:bookmarkStart w:id="13" w:name="_sec13"/>
       <w:r>
@@ -2738,6 +2910,9 @@
       <w:bookmarkEnd w:id="13"/>
     </w:p>
     <w:p>
+      <w:pPr>
+        <w:widowControl/>
+      </w:pPr>
       <w:r>
         <w:t>Foreign health systems active in Egypt are mostly European, with two American institutions. Mayo Clinic counts Saudi German Hospital Cairo in its Care Network, and the University of Texas Medical Branch supports Badya University's health schools.</w:t>
       </w:r>
@@ -2810,6 +2985,8 @@
     </w:p>
     <w:p>
       <w:pPr>
+        <w:keepNext/>
+        <w:widowControl/>
         <w:jc w:val="center"/>
       </w:pPr>
       <w:r>
@@ -2848,6 +3025,9 @@
       </w:r>
     </w:p>
     <w:p>
+      <w:pPr>
+        <w:widowControl/>
+      </w:pPr>
       <w:r>
         <w:rPr>
           <w:i/>
@@ -2859,6 +3039,8 @@
     </w:p>
     <w:p>
       <w:pPr>
+        <w:keepNext/>
+        <w:widowControl/>
         <w:spacing w:before="160"/>
       </w:pPr>
       <w:r>
@@ -2889,12 +3071,19 @@
         <w:gridCol w:w="2436"/>
       </w:tblGrid>
       <w:tr>
+        <w:trPr>
+          <w:cantSplit/>
+          <w:tblHeader/>
+        </w:trPr>
         <w:tc>
           <w:tcPr>
             <w:tcW w:type="dxa" w:w="2835"/>
             <w:shd w:val="clear" w:color="auto" w:fill="D91F2C"/>
           </w:tcPr>
           <w:p>
+            <w:pPr>
+              <w:keepNext/>
+            </w:pPr>
             <w:r>
               <w:rPr>
                 <w:b/>
@@ -2911,6 +3100,9 @@
             <w:shd w:val="clear" w:color="auto" w:fill="D91F2C"/>
           </w:tcPr>
           <w:p>
+            <w:pPr>
+              <w:keepNext/>
+            </w:pPr>
             <w:r>
               <w:rPr>
                 <w:b/>
@@ -2927,6 +3119,9 @@
             <w:shd w:val="clear" w:color="auto" w:fill="D91F2C"/>
           </w:tcPr>
           <w:p>
+            <w:pPr>
+              <w:keepNext/>
+            </w:pPr>
             <w:r>
               <w:rPr>
                 <w:b/>
@@ -2943,6 +3138,9 @@
             <w:shd w:val="clear" w:color="auto" w:fill="D91F2C"/>
           </w:tcPr>
           <w:p>
+            <w:pPr>
+              <w:keepNext/>
+            </w:pPr>
             <w:r>
               <w:rPr>
                 <w:b/>
@@ -2955,6 +3153,9 @@
         </w:tc>
       </w:tr>
       <w:tr>
+        <w:trPr>
+          <w:cantSplit/>
+        </w:trPr>
         <w:tc>
           <w:tcPr>
             <w:tcW w:type="dxa" w:w="1587"/>
@@ -2962,6 +3163,9 @@
             <w:shd w:val="clear" w:color="auto" w:fill="F6E3E4"/>
           </w:tcPr>
           <w:p>
+            <w:pPr>
+              <w:keepNext/>
+            </w:pPr>
             <w:r>
               <w:rPr>
                 <w:b/>
@@ -2974,11 +3178,17 @@
         </w:tc>
       </w:tr>
       <w:tr>
+        <w:trPr>
+          <w:cantSplit/>
+        </w:trPr>
         <w:tc>
           <w:tcPr>
             <w:tcW w:type="dxa" w:w="2835"/>
           </w:tcPr>
           <w:p>
+            <w:pPr>
+              <w:keepNext/>
+            </w:pPr>
             <w:r>
               <w:rPr>
                 <w:b/>
@@ -2993,6 +3203,9 @@
             <w:tcW w:type="dxa" w:w="1701"/>
           </w:tcPr>
           <w:p>
+            <w:pPr>
+              <w:keepNext/>
+            </w:pPr>
             <w:r>
               <w:rPr>
                 <w:b w:val="0"/>
@@ -3007,6 +3220,9 @@
             <w:tcW w:type="dxa" w:w="3515"/>
           </w:tcPr>
           <w:p>
+            <w:pPr>
+              <w:keepNext/>
+            </w:pPr>
             <w:r>
               <w:rPr>
                 <w:b w:val="0"/>
@@ -3021,6 +3237,9 @@
             <w:tcW w:type="dxa" w:w="1587"/>
           </w:tcPr>
           <w:p>
+            <w:pPr>
+              <w:keepNext/>
+            </w:pPr>
             <w:r>
               <w:rPr>
                 <w:b w:val="0"/>
@@ -3041,11 +3260,17 @@
         </w:tc>
       </w:tr>
       <w:tr>
+        <w:trPr>
+          <w:cantSplit/>
+        </w:trPr>
         <w:tc>
           <w:tcPr>
             <w:tcW w:type="dxa" w:w="2835"/>
           </w:tcPr>
           <w:p>
+            <w:pPr>
+              <w:keepNext/>
+            </w:pPr>
             <w:r>
               <w:rPr>
                 <w:b/>
@@ -3060,6 +3285,9 @@
             <w:tcW w:type="dxa" w:w="1701"/>
           </w:tcPr>
           <w:p>
+            <w:pPr>
+              <w:keepNext/>
+            </w:pPr>
             <w:r>
               <w:rPr>
                 <w:b w:val="0"/>
@@ -3074,6 +3302,9 @@
             <w:tcW w:type="dxa" w:w="3515"/>
           </w:tcPr>
           <w:p>
+            <w:pPr>
+              <w:keepNext/>
+            </w:pPr>
             <w:r>
               <w:rPr>
                 <w:b w:val="0"/>
@@ -3088,6 +3319,9 @@
             <w:tcW w:type="dxa" w:w="1587"/>
           </w:tcPr>
           <w:p>
+            <w:pPr>
+              <w:keepNext/>
+            </w:pPr>
             <w:r>
               <w:rPr>
                 <w:b w:val="0"/>
@@ -3108,6 +3342,9 @@
         </w:tc>
       </w:tr>
       <w:tr>
+        <w:trPr>
+          <w:cantSplit/>
+        </w:trPr>
         <w:tc>
           <w:tcPr>
             <w:tcW w:type="dxa" w:w="1587"/>
@@ -3115,6 +3352,9 @@
             <w:shd w:val="clear" w:color="auto" w:fill="F6E3E4"/>
           </w:tcPr>
           <w:p>
+            <w:pPr>
+              <w:keepNext/>
+            </w:pPr>
             <w:r>
               <w:rPr>
                 <w:b/>
@@ -3127,11 +3367,17 @@
         </w:tc>
       </w:tr>
       <w:tr>
+        <w:trPr>
+          <w:cantSplit/>
+        </w:trPr>
         <w:tc>
           <w:tcPr>
             <w:tcW w:type="dxa" w:w="2835"/>
           </w:tcPr>
           <w:p>
+            <w:pPr>
+              <w:keepNext/>
+            </w:pPr>
             <w:r>
               <w:rPr>
                 <w:b/>
@@ -3146,6 +3392,9 @@
             <w:tcW w:type="dxa" w:w="1701"/>
           </w:tcPr>
           <w:p>
+            <w:pPr>
+              <w:keepNext/>
+            </w:pPr>
             <w:r>
               <w:rPr>
                 <w:b w:val="0"/>
@@ -3160,6 +3409,9 @@
             <w:tcW w:type="dxa" w:w="3515"/>
           </w:tcPr>
           <w:p>
+            <w:pPr>
+              <w:keepNext/>
+            </w:pPr>
             <w:r>
               <w:rPr>
                 <w:b w:val="0"/>
@@ -3174,6 +3426,9 @@
             <w:tcW w:type="dxa" w:w="1587"/>
           </w:tcPr>
           <w:p>
+            <w:pPr>
+              <w:keepNext/>
+            </w:pPr>
             <w:r>
               <w:rPr>
                 <w:b w:val="0"/>
@@ -3194,11 +3449,17 @@
         </w:tc>
       </w:tr>
       <w:tr>
+        <w:trPr>
+          <w:cantSplit/>
+        </w:trPr>
         <w:tc>
           <w:tcPr>
             <w:tcW w:type="dxa" w:w="2835"/>
           </w:tcPr>
           <w:p>
+            <w:pPr>
+              <w:keepNext/>
+            </w:pPr>
             <w:r>
               <w:rPr>
                 <w:b/>
@@ -3213,6 +3474,9 @@
             <w:tcW w:type="dxa" w:w="1701"/>
           </w:tcPr>
           <w:p>
+            <w:pPr>
+              <w:keepNext/>
+            </w:pPr>
             <w:r>
               <w:rPr>
                 <w:b w:val="0"/>
@@ -3227,6 +3491,9 @@
             <w:tcW w:type="dxa" w:w="3515"/>
           </w:tcPr>
           <w:p>
+            <w:pPr>
+              <w:keepNext/>
+            </w:pPr>
             <w:r>
               <w:rPr>
                 <w:b w:val="0"/>
@@ -3241,6 +3508,9 @@
             <w:tcW w:type="dxa" w:w="1587"/>
           </w:tcPr>
           <w:p>
+            <w:pPr>
+              <w:keepNext/>
+            </w:pPr>
             <w:r>
               <w:rPr>
                 <w:b w:val="0"/>
@@ -3261,11 +3531,17 @@
         </w:tc>
       </w:tr>
       <w:tr>
+        <w:trPr>
+          <w:cantSplit/>
+        </w:trPr>
         <w:tc>
           <w:tcPr>
             <w:tcW w:type="dxa" w:w="2835"/>
           </w:tcPr>
           <w:p>
+            <w:pPr>
+              <w:keepNext/>
+            </w:pPr>
             <w:r>
               <w:rPr>
                 <w:b/>
@@ -3280,6 +3556,9 @@
             <w:tcW w:type="dxa" w:w="1701"/>
           </w:tcPr>
           <w:p>
+            <w:pPr>
+              <w:keepNext/>
+            </w:pPr>
             <w:r>
               <w:rPr>
                 <w:b w:val="0"/>
@@ -3294,6 +3573,9 @@
             <w:tcW w:type="dxa" w:w="3515"/>
           </w:tcPr>
           <w:p>
+            <w:pPr>
+              <w:keepNext/>
+            </w:pPr>
             <w:r>
               <w:rPr>
                 <w:b w:val="0"/>
@@ -3308,6 +3590,9 @@
             <w:tcW w:type="dxa" w:w="1587"/>
           </w:tcPr>
           <w:p>
+            <w:pPr>
+              <w:keepNext/>
+            </w:pPr>
             <w:r>
               <w:rPr>
                 <w:b w:val="0"/>
@@ -3328,11 +3613,17 @@
         </w:tc>
       </w:tr>
       <w:tr>
+        <w:trPr>
+          <w:cantSplit/>
+        </w:trPr>
         <w:tc>
           <w:tcPr>
             <w:tcW w:type="dxa" w:w="2835"/>
           </w:tcPr>
           <w:p>
+            <w:pPr>
+              <w:keepNext/>
+            </w:pPr>
             <w:r>
               <w:rPr>
                 <w:b/>
@@ -3347,6 +3638,9 @@
             <w:tcW w:type="dxa" w:w="1701"/>
           </w:tcPr>
           <w:p>
+            <w:pPr>
+              <w:keepNext/>
+            </w:pPr>
             <w:r>
               <w:rPr>
                 <w:b w:val="0"/>
@@ -3361,6 +3655,9 @@
             <w:tcW w:type="dxa" w:w="3515"/>
           </w:tcPr>
           <w:p>
+            <w:pPr>
+              <w:keepNext/>
+            </w:pPr>
             <w:r>
               <w:rPr>
                 <w:b w:val="0"/>
@@ -3375,6 +3672,9 @@
             <w:tcW w:type="dxa" w:w="1587"/>
           </w:tcPr>
           <w:p>
+            <w:pPr>
+              <w:keepNext/>
+            </w:pPr>
             <w:r>
               <w:rPr>
                 <w:b w:val="0"/>
@@ -3395,11 +3695,17 @@
         </w:tc>
       </w:tr>
       <w:tr>
+        <w:trPr>
+          <w:cantSplit/>
+        </w:trPr>
         <w:tc>
           <w:tcPr>
             <w:tcW w:type="dxa" w:w="2835"/>
           </w:tcPr>
           <w:p>
+            <w:pPr>
+              <w:keepNext/>
+            </w:pPr>
             <w:r>
               <w:rPr>
                 <w:b/>
@@ -3414,6 +3720,9 @@
             <w:tcW w:type="dxa" w:w="1701"/>
           </w:tcPr>
           <w:p>
+            <w:pPr>
+              <w:keepNext/>
+            </w:pPr>
             <w:r>
               <w:rPr>
                 <w:b w:val="0"/>
@@ -3428,6 +3737,9 @@
             <w:tcW w:type="dxa" w:w="3515"/>
           </w:tcPr>
           <w:p>
+            <w:pPr>
+              <w:keepNext/>
+            </w:pPr>
             <w:r>
               <w:rPr>
                 <w:b w:val="0"/>
@@ -3442,6 +3754,9 @@
             <w:tcW w:type="dxa" w:w="1587"/>
           </w:tcPr>
           <w:p>
+            <w:pPr>
+              <w:keepNext/>
+            </w:pPr>
             <w:r>
               <w:rPr>
                 <w:b w:val="0"/>
@@ -3462,11 +3777,17 @@
         </w:tc>
       </w:tr>
       <w:tr>
+        <w:trPr>
+          <w:cantSplit/>
+        </w:trPr>
         <w:tc>
           <w:tcPr>
             <w:tcW w:type="dxa" w:w="2835"/>
           </w:tcPr>
           <w:p>
+            <w:pPr>
+              <w:keepNext/>
+            </w:pPr>
             <w:r>
               <w:rPr>
                 <w:b/>
@@ -3481,6 +3802,9 @@
             <w:tcW w:type="dxa" w:w="1701"/>
           </w:tcPr>
           <w:p>
+            <w:pPr>
+              <w:keepNext/>
+            </w:pPr>
             <w:r>
               <w:rPr>
                 <w:b w:val="0"/>
@@ -3495,6 +3819,9 @@
             <w:tcW w:type="dxa" w:w="3515"/>
           </w:tcPr>
           <w:p>
+            <w:pPr>
+              <w:keepNext/>
+            </w:pPr>
             <w:r>
               <w:rPr>
                 <w:b w:val="0"/>
@@ -3509,6 +3836,9 @@
             <w:tcW w:type="dxa" w:w="1587"/>
           </w:tcPr>
           <w:p>
+            <w:pPr>
+              <w:keepNext/>
+            </w:pPr>
             <w:r>
               <w:rPr>
                 <w:b w:val="0"/>
@@ -3529,11 +3859,17 @@
         </w:tc>
       </w:tr>
       <w:tr>
+        <w:trPr>
+          <w:cantSplit/>
+        </w:trPr>
         <w:tc>
           <w:tcPr>
             <w:tcW w:type="dxa" w:w="2835"/>
           </w:tcPr>
           <w:p>
+            <w:pPr>
+              <w:keepNext/>
+            </w:pPr>
             <w:r>
               <w:rPr>
                 <w:b/>
@@ -3548,6 +3884,9 @@
             <w:tcW w:type="dxa" w:w="1701"/>
           </w:tcPr>
           <w:p>
+            <w:pPr>
+              <w:keepNext/>
+            </w:pPr>
             <w:r>
               <w:rPr>
                 <w:b w:val="0"/>
@@ -3562,6 +3901,9 @@
             <w:tcW w:type="dxa" w:w="3515"/>
           </w:tcPr>
           <w:p>
+            <w:pPr>
+              <w:keepNext/>
+            </w:pPr>
             <w:r>
               <w:rPr>
                 <w:b w:val="0"/>
@@ -3576,6 +3918,9 @@
             <w:tcW w:type="dxa" w:w="1587"/>
           </w:tcPr>
           <w:p>
+            <w:pPr>
+              <w:keepNext/>
+            </w:pPr>
             <w:r>
               <w:rPr>
                 <w:b w:val="0"/>
@@ -3596,6 +3941,9 @@
         </w:tc>
       </w:tr>
       <w:tr>
+        <w:trPr>
+          <w:cantSplit/>
+        </w:trPr>
         <w:tc>
           <w:tcPr>
             <w:tcW w:type="dxa" w:w="2835"/>
@@ -3664,6 +4012,9 @@
       </w:tr>
     </w:tbl>
     <w:p>
+      <w:pPr>
+        <w:widowControl/>
+      </w:pPr>
       <w:r>
         <w:rPr>
           <w:i/>
@@ -3674,6 +4025,9 @@
       </w:r>
     </w:p>
     <w:p>
+      <w:pPr>
+        <w:widowControl/>
+      </w:pPr>
       <w:r>
         <w:t>Egypt is only beginning to compete for international patients. The General Authority for Healthcare reported treating about 35,000 patients from 124 countries in 2025, with revenue of about $8 million, up from about $3.7 million in 2024.</w:t>
       </w:r>
@@ -3705,6 +4059,8 @@
     <w:p>
       <w:pPr>
         <w:pStyle w:val="Heading1"/>
+        <w:keepNext/>
+        <w:widowControl/>
       </w:pPr>
       <w:bookmarkStart w:id="14" w:name="_sec14"/>
       <w:r>
@@ -3715,6 +4071,8 @@
     <w:p>
       <w:pPr>
         <w:spacing w:before="0" w:after="80"/>
+        <w:keepNext/>
+        <w:widowControl/>
         <w:pBdr>
           <w:bottom w:val="single" w:sz="12" w:space="1" w:color="D91F2C"/>
         </w:pBdr>
@@ -3722,6 +4080,8 @@
     </w:p>
     <w:p>
       <w:pPr>
+        <w:keepNext/>
+        <w:widowControl/>
         <w:spacing w:after="40"/>
       </w:pPr>
       <w:r>
@@ -3740,6 +4100,7 @@
     </w:p>
     <w:p>
       <w:pPr>
+        <w:widowControl/>
         <w:spacing w:after="240"/>
       </w:pPr>
       <w:r>
@@ -3769,6 +4130,8 @@
     </w:p>
     <w:p>
       <w:pPr>
+        <w:keepNext/>
+        <w:widowControl/>
         <w:spacing w:after="40"/>
       </w:pPr>
       <w:r>
@@ -3787,6 +4150,7 @@
     </w:p>
     <w:p>
       <w:pPr>
+        <w:widowControl/>
         <w:spacing w:after="240"/>
       </w:pPr>
       <w:r>
@@ -3816,6 +4180,8 @@
     </w:p>
     <w:p>
       <w:pPr>
+        <w:keepNext/>
+        <w:widowControl/>
         <w:spacing w:after="40"/>
       </w:pPr>
       <w:r>
@@ -3834,6 +4200,7 @@
     </w:p>
     <w:p>
       <w:pPr>
+        <w:widowControl/>
         <w:spacing w:after="240"/>
       </w:pPr>
       <w:r>
@@ -3851,6 +4218,8 @@
     </w:p>
     <w:p>
       <w:pPr>
+        <w:keepNext/>
+        <w:widowControl/>
         <w:spacing w:after="40"/>
       </w:pPr>
       <w:r>
@@ -3869,6 +4238,7 @@
     </w:p>
     <w:p>
       <w:pPr>
+        <w:widowControl/>
         <w:spacing w:after="240"/>
       </w:pPr>
       <w:r>
@@ -3886,6 +4256,8 @@
     </w:p>
     <w:p>
       <w:pPr>
+        <w:keepNext/>
+        <w:widowControl/>
         <w:spacing w:after="40"/>
       </w:pPr>
       <w:r>
@@ -3904,6 +4276,7 @@
     </w:p>
     <w:p>
       <w:pPr>
+        <w:widowControl/>
         <w:spacing w:after="240"/>
       </w:pPr>
       <w:r>
@@ -3941,13 +4314,10 @@
       </w:hyperlink>
     </w:p>
     <w:p>
-      <w:r>
-        <w:br w:type="page"/>
-      </w:r>
-    </w:p>
-    <w:p>
       <w:pPr>
         <w:pStyle w:val="Heading1"/>
+        <w:keepNext/>
+        <w:widowControl/>
       </w:pPr>
       <w:bookmarkStart w:id="15" w:name="_sec15"/>
       <w:r>
@@ -3958,12 +4328,17 @@
     <w:p>
       <w:pPr>
         <w:spacing w:before="0" w:after="80"/>
+        <w:keepNext/>
+        <w:widowControl/>
         <w:pBdr>
           <w:bottom w:val="single" w:sz="12" w:space="1" w:color="D91F2C"/>
         </w:pBdr>
       </w:pPr>
     </w:p>
     <w:p>
+      <w:pPr>
+        <w:widowControl/>
+      </w:pPr>
       <w:r>
         <w:rPr>
           <w:i/>
@@ -3975,6 +4350,8 @@
     </w:p>
     <w:p>
       <w:pPr>
+        <w:keepNext/>
+        <w:widowControl/>
         <w:spacing w:after="200"/>
       </w:pPr>
       <w:r>
@@ -3996,6 +4373,8 @@
     </w:p>
     <w:p>
       <w:pPr>
+        <w:keepNext/>
+        <w:widowControl/>
         <w:spacing w:after="200"/>
       </w:pPr>
       <w:r>
@@ -4017,6 +4396,8 @@
     </w:p>
     <w:p>
       <w:pPr>
+        <w:keepNext/>
+        <w:widowControl/>
         <w:spacing w:after="200"/>
       </w:pPr>
       <w:r>
@@ -4038,6 +4419,8 @@
     </w:p>
     <w:p>
       <w:pPr>
+        <w:keepNext/>
+        <w:widowControl/>
         <w:spacing w:after="200"/>
       </w:pPr>
       <w:r>
@@ -4059,6 +4442,8 @@
     </w:p>
     <w:p>
       <w:pPr>
+        <w:keepNext/>
+        <w:widowControl/>
         <w:spacing w:after="200"/>
       </w:pPr>
       <w:r>
@@ -4080,6 +4465,8 @@
     </w:p>
     <w:p>
       <w:pPr>
+        <w:keepNext/>
+        <w:widowControl/>
         <w:spacing w:after="200"/>
       </w:pPr>
       <w:r>

</xml_diff>